<commit_message>
feat: Add authentication views and update settings for login/logout
- Added LOGIN_URL, LOGIN_REDIRECT_URL, and LOGOUT_REDIRECT_URL to settings.py.
- Implemented login and logout views in urls.py.
- Created a base template for consistent layout across pages.
- Developed dashboard, facility list, detail, and edit templates.
- Introduced MOU generation and history templates.
- Added CSS and JS for improved UI/UX.
- Created migrations for facility information model updates.
- Deleted obsolete MOU document.
</commit_message>
<xml_diff>
--- a/App/mou_templates/Canteen.docx
+++ b/App/mou_templates/Canteen.docx
@@ -1136,6 +1136,11 @@
       </w:pPr>
       <w:r>
         <w:t>IN WITNESS WHERE OF, the parties here to have caused this Agreement to be executed as of the date written below by their duly authorized representatives.</w:t>
+      </w:r>
+    </w:p>
+    <w:p>
+      <w:r>
+        <w:br w:type="page"/>
       </w:r>
     </w:p>
     <w:p>

</xml_diff>